<commit_message>
AIB refinements: TSLP (mepolizumab/astegolimab ALIENTO-ARNASA/solrikitug + COPD now 2 biologics), IL-4Ra (rocatinlimab=Kyowa Kirin not Pfizer; soften Kaposi claim), IGF-1R (ACELYRIN→Alumis merger)
</commit_message>
<xml_diff>
--- a/AIB_IGF1R_TSHR_thyroid_eye_disease_v1.docx
+++ b/AIB_IGF1R_TSHR_thyroid_eye_disease_v1.docx
@@ -933,7 +933,7 @@
       <w:r>
         <w:t xml:space="preserve">TED went from no approved drug to a one-product, multi-billion-dollar market with </w:t>
       </w:r>
-      <w:hyperlink w:history="1" r:id="rIdrll_2868qihcu-0ik5hze">
+      <w:hyperlink w:history="1" r:id="rIdenbqygqru-s8hmhfunzld">
         <w:r>
           <w:rPr>
             <w:rStyle w:val="Hyperlink"/>
@@ -944,7 +944,7 @@
       <w:r>
         <w:t xml:space="preserve"> and triggered Amgen's </w:t>
       </w:r>
-      <w:hyperlink w:history="1" r:id="rIdkkkheczfs-obksvsyjbwf">
+      <w:hyperlink w:history="1" r:id="rId3moe_mlowtzlszwooeze4">
         <w:r>
           <w:rPr>
             <w:rStyle w:val="Hyperlink"/>
@@ -971,7 +971,7 @@
       <w:r>
         <w:t xml:space="preserve">Thyroid eye disease is the orbital manifestation of Graves' autoimmunity: TSHR autoantibodies, acting through the IGF-1R/TSHR complex on orbital fibroblasts, drive tissue expansion, inflammation and scarring — producing proptosis, double vision, pain and, in the worst cases, optic-nerve compression and vision loss. </w:t>
       </w:r>
-      <w:hyperlink w:history="1" r:id="rIdpoizbyx95waqzsuxfwddj">
+      <w:hyperlink w:history="1" r:id="rIdltgo94s5offjcyic2gykv">
         <w:r>
           <w:rPr>
             <w:rStyle w:val="Hyperlink"/>
@@ -1422,7 +1422,7 @@
       <w:r>
         <w:t xml:space="preserve"> (the </w:t>
       </w:r>
-      <w:hyperlink w:history="1" r:id="rIdc2f99udw9cwkuzqsikkwo">
+      <w:hyperlink w:history="1" r:id="rIdl8327p2tclvyup_ujg72e">
         <w:r>
           <w:rPr>
             <w:rStyle w:val="Hyperlink"/>
@@ -1469,7 +1469,7 @@
       <w:r>
         <w:t xml:space="preserve">Effector blockade is decisively validated: </w:t>
       </w:r>
-      <w:hyperlink w:history="1" r:id="rId2thvvt1g3_6fitqljrwae">
+      <w:hyperlink w:history="1" r:id="rIdblywvsx3axp9qidtofce1">
         <w:r>
           <w:rPr>
             <w:rStyle w:val="Hyperlink"/>
@@ -1480,7 +1480,7 @@
       <w:r>
         <w:t xml:space="preserve"> and </w:t>
       </w:r>
-      <w:hyperlink w:history="1" r:id="rId3je9wbqlnqtjkajp14stu">
+      <w:hyperlink w:history="1" r:id="rIdh7tqpdxmerfeekcxjf61f">
         <w:r>
           <w:rPr>
             <w:rStyle w:val="Hyperlink"/>
@@ -2320,7 +2320,7 @@
                 <w:sz w:val="17"/>
                 <w:szCs w:val="17"/>
               </w:rPr>
-              <w:t xml:space="preserve">ACELYRIN</w:t>
+              <w:t xml:space="preserve">Alumis (ex-ACELYRIN)</w:t>
             </w:r>
           </w:p>
         </w:tc>
@@ -2419,7 +2419,7 @@
                 <w:sz w:val="17"/>
                 <w:szCs w:val="17"/>
               </w:rPr>
-              <w:t xml:space="preserve">early SC data</w:t>
+              <w:t xml:space="preserve">Ph1/2 data</w:t>
             </w:r>
           </w:p>
         </w:tc>
@@ -2808,7 +2808,7 @@
             <w:r>
               <w:t xml:space="preserve">The approved standard is </w:t>
             </w:r>
-            <w:hyperlink w:history="1" r:id="rIdzfhvyo08zpscn_gcripcc">
+            <w:hyperlink w:history="1" r:id="rIdhcajbzbhgi9d6fdfafbkf">
               <w:r>
                 <w:rPr>
                   <w:rStyle w:val="Hyperlink"/>
@@ -2819,7 +2819,7 @@
             <w:r>
               <w:t xml:space="preserve">; </w:t>
             </w:r>
-            <w:hyperlink w:history="1" r:id="rIdlwpreombpjxg7gskm8jg8">
+            <w:hyperlink w:history="1" r:id="rIdjcdhiplmh8kw-zfz1l3lr">
               <w:r>
                 <w:rPr>
                   <w:rStyle w:val="Hyperlink"/>
@@ -3345,7 +3345,7 @@
                 <w:sz w:val="17"/>
                 <w:szCs w:val="17"/>
               </w:rPr>
-              <w:t xml:space="preserve">ACELYRIN (independent)</w:t>
+              <w:t xml:space="preserve">Alumis (ex-ACELYRIN)</w:t>
             </w:r>
           </w:p>
         </w:tc>
@@ -3411,7 +3411,7 @@
                 <w:sz w:val="17"/>
                 <w:szCs w:val="17"/>
               </w:rPr>
-              <w:t xml:space="preserve">an SC IGF-1R contender in a small company</w:t>
+              <w:t xml:space="preserve">an SC IGF-1R contender; folded into Alumis (2025)</w:t>
             </w:r>
           </w:p>
         </w:tc>
@@ -3710,7 +3710,7 @@
           <w:b/>
           <w:bCs/>
         </w:rPr>
-        <w:t xml:space="preserve">Viridian (the deepest, IV + SC), ACELYRIN, Sling</w:t>
+        <w:t xml:space="preserve">Viridian (the deepest, IV + SC), Alumis, Sling</w:t>
       </w:r>
       <w:r>
         <w:t xml:space="preserve"> — racing on format and safety. That is where a TED position is acquirable; Viridian is the cleanest pure-play takeout for an acquirer wanting to challenge or complement teprotumumab.</w:t>
@@ -4604,7 +4604,7 @@
         </w:rPr>
         <w:t xml:space="preserve">Hearing impairment is the signature risk. </w:t>
       </w:r>
-      <w:hyperlink w:history="1" r:id="rIdd_z6n5bfadn-ftkxqecoz">
+      <w:hyperlink w:history="1" r:id="rIded4_bqzk1zkt8bcd_jnd3">
         <w:r>
           <w:rPr>
             <w:rStyle w:val="Hyperlink"/>
@@ -5846,7 +5846,7 @@
       <w:r>
         <w:t xml:space="preserve">Teprotumumab is among the most expensive specialty courses in ophthalmology (a multi-infusion course running into six figures), supporting a </w:t>
       </w:r>
-      <w:hyperlink w:history="1" r:id="rIdjiyr6fqxsypndsczim9hu">
+      <w:hyperlink w:history="1" r:id="rIdmdvjk2ht5mgphysp_mx_e">
         <w:r>
           <w:rPr>
             <w:rStyle w:val="Hyperlink"/>
@@ -6419,7 +6419,7 @@
                 <w:b/>
                 <w:bCs/>
               </w:rPr>
-              <w:t xml:space="preserve">ACELYRIN / Sling</w:t>
+              <w:t xml:space="preserve">Alumis / Sling</w:t>
             </w:r>
           </w:p>
         </w:tc>
@@ -6551,7 +6551,7 @@
                 <w:sz w:val="17"/>
                 <w:szCs w:val="17"/>
               </w:rPr>
-              <w:t xml:space="preserve">SC and oral IGF-1R; smaller takeout / partner targets</w:t>
+              <w:t xml:space="preserve">SC (lonigutamab, ex-ACELYRIN) and oral IGF-1R; smaller takeout / partner targets</w:t>
             </w:r>
           </w:p>
         </w:tc>
@@ -7007,7 +7007,7 @@
         <w:spacing w:after="120"/>
       </w:pPr>
       <w:r>
-        <w:t xml:space="preserve">TED development is led by US biotech (Viridian, ACELYRIN, Sling) under Amgen's incumbent franchise — a Western-concentrated field, in contrast to the China-heavy bispecific supply in IBD and respiratory. The likely transactions are US-biotech takeouts (Viridian the cleanest) or format-defense moves by Amgen. China-origin IGF-1R and TSHR programs are emerging but earlier; they are the next wave rather than today's competitive set.</w:t>
+        <w:t xml:space="preserve">TED development is led by US biotech (Viridian; Alumis, which absorbed ACELYRIN in 2025; Sling) under Amgen's incumbent franchise — a Western-concentrated field, in contrast to the China-heavy bispecific supply in IBD and respiratory. The likely transactions are US-biotech takeouts (Viridian the cleanest) or format-defense moves by Amgen. China-origin IGF-1R and TSHR programs are emerging but earlier; they are the next wave rather than today's competitive set.</w:t>
       </w:r>
     </w:p>
     <w:p>

</xml_diff>